<commit_message>
Sync portfolio role fit and career knowledge
</commit_message>
<xml_diff>
--- a/docs/resume/word/LucasCruz_CV_EN.docx
+++ b/docs/resume/word/LucasCruz_CV_EN.docx
@@ -70,7 +70,7 @@
         <w:rPr>
           <w:sz w:val="20"/>
         </w:rPr>
-        <w:t>Senior Data Engineer and Gen. AI Automation Engineer with 5+ years of experience building production data pipelines, cloud lakehouses, and LLM/n8n automation across IoT, fintech, agribusiness, and automotive intelligence. Proven track record delivering end-to-end data platforms, governed analytics datasets, conversational AI workflows, and automated reporting systems. Fluent in English (C1); open to relocation across Europe.</w:t>
+        <w:t>Senior Data Engineer and Gen. AI Automation Engineer with 5+ years of experience building production data pipelines, cloud lakehouses, and LLM/n8n automation across IoT, fintech, agribusiness, and automotive intelligence. Proven track record delivering end-to-end data platforms, governed analytics datasets, conversational AI workflows, automated reporting systems, and customer-facing product implementation. Fluent in English (C1); open to relocation across Europe.</w:t>
       </w:r>
     </w:p>
     <w:p>
@@ -405,6 +405,19 @@
           <w:sz w:val="20"/>
         </w:rPr>
         <w:t>Deployed containerised backend services on Azure using Docker, standardising infrastructure environments and improving deployment reliability.</w:t>
+      </w:r>
+    </w:p>
+    <w:p>
+      <w:pPr>
+        <w:pStyle w:val="ListBullet"/>
+        <w:spacing w:after="40"/>
+        <w:ind w:left="216"/>
+      </w:pPr>
+      <w:r>
+        <w:rPr>
+          <w:sz w:val="20"/>
+        </w:rPr>
+        <w:t>Coordinated Notion-based delivery sprints, customer-facing demos, product training, sales support, and post-launch support while preparing Play Store/EAS/DUNS mobile launch readiness.</w:t>
       </w:r>
     </w:p>
     <w:p>

</xml_diff>